<commit_message>
update files and recording
</commit_message>
<xml_diff>
--- a/学习记录.docx
+++ b/学习记录.docx
@@ -23,7 +23,30 @@
           <w:szCs w:val="24"/>
           <w:highlight w:val="none"/>
         </w:rPr>
-        <w:t>一、文件《hello_Cpp》（2026/5/2</w:t>
+        <w:t>一、文件《</w:t>
+      </w:r>
+      <w:r>
+        <w:rPr>
+          <w:rFonts w:hint="eastAsia" w:ascii="宋体" w:hAnsi="宋体"/>
+          <w:b/>
+          <w:color w:val="auto"/>
+          <w:sz w:val="36"/>
+          <w:szCs w:val="24"/>
+          <w:highlight w:val="none"/>
+          <w:lang w:val="en-US" w:eastAsia="zh-CN"/>
+        </w:rPr>
+        <w:t>1_</w:t>
+      </w:r>
+      <w:r>
+        <w:rPr>
+          <w:rFonts w:hint="eastAsia" w:ascii="宋体" w:hAnsi="宋体" w:eastAsia="宋体"/>
+          <w:b/>
+          <w:color w:val="auto"/>
+          <w:sz w:val="36"/>
+          <w:szCs w:val="24"/>
+          <w:highlight w:val="none"/>
+        </w:rPr>
+        <w:t>hello_Cpp》（2026/5/2</w:t>
       </w:r>
       <w:r>
         <w:rPr>
@@ -112,6 +135,8 @@
         </w:rPr>
         <w:t>#include&lt;iostream&gt;</w:t>
       </w:r>
+      <w:bookmarkStart w:id="0" w:name="_GoBack"/>
+      <w:bookmarkEnd w:id="0"/>
     </w:p>
     <w:p>
       <w:pPr>
@@ -140,8 +165,6 @@
         </w:rPr>
         <w:t>using namespace std;</w:t>
       </w:r>
-      <w:bookmarkStart w:id="0" w:name="_GoBack"/>
-      <w:bookmarkEnd w:id="0"/>
     </w:p>
     <w:p>
       <w:pPr>

</xml_diff>